<commit_message>
new rules to configure styles
</commit_message>
<xml_diff>
--- a/resources/gost_example.docx
+++ b/resources/gost_example.docx
@@ -68,56 +68,69 @@
         <w:t xml:space="preserve"> рис., 2 табл.,</w:t>
       </w:r>
       <w:r>
-        <w:t xml:space="preserve"> 6 лист</w:t>
-      </w:r>
-      <w:proofErr w:type="gramStart"/>
+        <w:t xml:space="preserve"> 6 лист.</w:t>
+      </w:r>
+      <w:r>
+        <w:t>,</w:t>
+      </w:r>
+      <w:r>
+        <w:t xml:space="preserve"> </w:t>
+      </w:r>
+      <w:r>
+        <w:t>9</w:t>
+      </w:r>
+      <w:r>
+        <w:t xml:space="preserve"> </w:t>
+      </w:r>
+      <w:proofErr w:type="spellStart"/>
+      <w:r>
+        <w:t>источн</w:t>
+      </w:r>
+      <w:proofErr w:type="spellEnd"/>
       <w:r>
         <w:t>.</w:t>
       </w:r>
-      <w:r>
-        <w:t>,</w:t>
-      </w:r>
-      <w:r>
+    </w:p>
+    <w:p>
+      <w:pPr>
+        <w:ind w:firstLine="0"/>
+      </w:pPr>
+      <w:r>
+        <w:t>КЛЮЧЕВЫЕ, СЛОВА, ЗАГЛАВНЫМИ, БУКВАМИ, 5-15 ШТУК</w:t>
+      </w:r>
+      <w:r>
+        <w:t xml:space="preserve">, </w:t>
+      </w:r>
+      <w:r>
+        <w:t>БЕЗ ОТСТУПА И ТОЧКИ В КОНЦЕ</w:t>
+      </w:r>
+    </w:p>
+    <w:p>
+      <w:pPr>
+        <w:rPr>
+          <w:lang w:val="en-US"/>
+        </w:rPr>
+      </w:pPr>
+      <w:r>
+        <w:t>Реферат</w:t>
+      </w:r>
+      <w:r>
+        <w:rPr>
+          <w:lang w:val="en-US"/>
+        </w:rPr>
         <w:t xml:space="preserve"> </w:t>
       </w:r>
-      <w:proofErr w:type="gramEnd"/>
-      <w:r>
-        <w:t>9</w:t>
-      </w:r>
-      <w:r>
+      <w:r>
+        <w:t>на</w:t>
+      </w:r>
+      <w:r>
+        <w:rPr>
+          <w:lang w:val="en-US"/>
+        </w:rPr>
         <w:t xml:space="preserve"> </w:t>
       </w:r>
-      <w:proofErr w:type="spellStart"/>
-      <w:r>
-        <w:t>источн</w:t>
-      </w:r>
-      <w:proofErr w:type="spellEnd"/>
-      <w:r>
-        <w:t>.</w:t>
-      </w:r>
-    </w:p>
-    <w:p>
-      <w:pPr>
-        <w:ind w:firstLine="0"/>
-      </w:pPr>
-      <w:r>
-        <w:t>КЛЮЧЕВЫЕ, СЛОВА, ЗАГЛАВНЫМИ, БУКВАМИ, 5-15 ШТУК</w:t>
-      </w:r>
-      <w:r>
-        <w:t xml:space="preserve">, </w:t>
-      </w:r>
-      <w:r>
-        <w:t>БЕЗ ОТСТУПА И ТОЧКИ В КОНЦЕ</w:t>
-      </w:r>
-    </w:p>
-    <w:p>
-      <w:pPr>
-        <w:rPr>
-          <w:lang w:val="en-US"/>
-        </w:rPr>
-      </w:pPr>
-      <w:r>
-        <w:t>Реферат</w:t>
+      <w:r>
+        <w:t>одной</w:t>
       </w:r>
       <w:r>
         <w:rPr>
@@ -126,24 +139,6 @@
         <w:t xml:space="preserve"> </w:t>
       </w:r>
       <w:r>
-        <w:t>на</w:t>
-      </w:r>
-      <w:r>
-        <w:rPr>
-          <w:lang w:val="en-US"/>
-        </w:rPr>
-        <w:t xml:space="preserve"> </w:t>
-      </w:r>
-      <w:r>
-        <w:t>одной</w:t>
-      </w:r>
-      <w:r>
-        <w:rPr>
-          <w:lang w:val="en-US"/>
-        </w:rPr>
-        <w:t xml:space="preserve"> </w:t>
-      </w:r>
-      <w:r>
         <w:t>странице</w:t>
       </w:r>
       <w:r>
@@ -152,33 +147,11 @@
         </w:rPr>
         <w:t xml:space="preserve">. </w:t>
       </w:r>
-      <w:proofErr w:type="spellStart"/>
-      <w:r>
-        <w:rPr>
-          <w:lang w:val="en-US"/>
-        </w:rPr>
-        <w:t>Lorem</w:t>
-      </w:r>
-      <w:proofErr w:type="spellEnd"/>
-      <w:r>
-        <w:rPr>
-          <w:lang w:val="en-US"/>
-        </w:rPr>
-        <w:t xml:space="preserve"> </w:t>
-      </w:r>
-      <w:proofErr w:type="spellStart"/>
-      <w:r>
-        <w:rPr>
-          <w:lang w:val="en-US"/>
-        </w:rPr>
-        <w:t>ipsum</w:t>
-      </w:r>
-      <w:proofErr w:type="spellEnd"/>
-      <w:r>
-        <w:rPr>
-          <w:lang w:val="en-US"/>
-        </w:rPr>
-        <w:t xml:space="preserve"> dolor sit met connecter adipescent elite. Sequa, mayors, evenkite ratione at toque, aspirator elm name Nique variator eius sent provident nescient molestees seeped Odio a liquid desert</w:t>
+      <w:r>
+        <w:rPr>
+          <w:lang w:val="en-US"/>
+        </w:rPr>
+        <w:t>Lorem ipsum dolor sit met connecter adipescent elite. Sequa, mayors, evenkite ratione at toque, aspirator elm name Nique variator eius sent provident nescient molestees seeped Odio a liquid desert</w:t>
       </w:r>
     </w:p>
     <w:p>
@@ -1331,14 +1304,12 @@
         </w:rPr>
         <w:t xml:space="preserve"> </w:t>
       </w:r>
-      <w:proofErr w:type="spellStart"/>
       <w:r>
         <w:rPr>
           <w:lang w:val="en-US"/>
         </w:rPr>
         <w:t>Odio</w:t>
       </w:r>
-      <w:proofErr w:type="spellEnd"/>
       <w:r>
         <w:rPr>
           <w:lang w:val="en-US"/>
@@ -1424,14 +1395,12 @@
       <w:pPr>
         <w:pStyle w:val="aff0"/>
       </w:pPr>
-      <w:proofErr w:type="spellStart"/>
       <w:r>
         <w:t>l</w:t>
       </w:r>
       <w:r>
         <w:t>orem</w:t>
       </w:r>
-      <w:proofErr w:type="spellEnd"/>
       <w:r>
         <w:t>,</w:t>
       </w:r>
@@ -1440,14 +1409,12 @@
       <w:pPr>
         <w:pStyle w:val="aff0"/>
       </w:pPr>
-      <w:proofErr w:type="spellStart"/>
       <w:r>
         <w:t>i</w:t>
       </w:r>
       <w:r>
         <w:t>psum</w:t>
       </w:r>
-      <w:proofErr w:type="spellEnd"/>
       <w:r>
         <w:t>,</w:t>
       </w:r>
@@ -1504,7 +1471,6 @@
           <w:lang w:val="en-US" w:eastAsia="ru-RU"/>
         </w:rPr>
       </w:pPr>
-      <w:proofErr w:type="spellStart"/>
       <w:r>
         <w:rPr>
           <w:lang w:val="en-US"/>
@@ -1517,26 +1483,11 @@
         </w:rPr>
         <w:t>orem</w:t>
       </w:r>
-      <w:proofErr w:type="spellEnd"/>
       <w:r>
         <w:rPr>
           <w:lang w:val="en-US" w:eastAsia="ru-RU"/>
         </w:rPr>
-        <w:t xml:space="preserve"> </w:t>
-      </w:r>
-      <w:proofErr w:type="spellStart"/>
-      <w:r>
-        <w:rPr>
-          <w:lang w:val="en-US" w:eastAsia="ru-RU"/>
-        </w:rPr>
-        <w:t>ipsum</w:t>
-      </w:r>
-      <w:proofErr w:type="spellEnd"/>
-      <w:r>
-        <w:rPr>
-          <w:lang w:val="en-US" w:eastAsia="ru-RU"/>
-        </w:rPr>
-        <w:t xml:space="preserve"> dolor sit </w:t>
+        <w:t xml:space="preserve"> ipsum dolor sit </w:t>
       </w:r>
       <w:r>
         <w:rPr>
@@ -1742,7 +1693,6 @@
           <w:lang w:val="en-US"/>
         </w:rPr>
       </w:pPr>
-      <w:proofErr w:type="spellStart"/>
       <w:r>
         <w:rPr>
           <w:lang w:val="en-US"/>
@@ -1755,21 +1705,18 @@
         </w:rPr>
         <w:t>ecimos</w:t>
       </w:r>
-      <w:proofErr w:type="spellEnd"/>
       <w:r>
         <w:rPr>
           <w:lang w:val="en-US"/>
         </w:rPr>
         <w:t xml:space="preserve"> </w:t>
       </w:r>
-      <w:proofErr w:type="spellStart"/>
       <w:r>
         <w:rPr>
           <w:lang w:val="en-US"/>
         </w:rPr>
         <w:t>Fuga</w:t>
       </w:r>
-      <w:proofErr w:type="spellEnd"/>
       <w:r>
         <w:rPr>
           <w:lang w:val="en-US"/>
@@ -1798,21 +1745,7 @@
         <w:rPr>
           <w:lang w:val="en-US"/>
         </w:rPr>
-        <w:t xml:space="preserve"> </w:t>
-      </w:r>
-      <w:proofErr w:type="spellStart"/>
-      <w:r>
-        <w:rPr>
-          <w:lang w:val="en-US"/>
-        </w:rPr>
-        <w:t>eius</w:t>
-      </w:r>
-      <w:proofErr w:type="spellEnd"/>
-      <w:r>
-        <w:rPr>
-          <w:lang w:val="en-US"/>
-        </w:rPr>
-        <w:t xml:space="preserve"> distinct;</w:t>
+        <w:t xml:space="preserve"> eius distinct;</w:t>
       </w:r>
     </w:p>
     <w:p>
@@ -2326,28 +2259,24 @@
         </w:rPr>
         <w:t xml:space="preserve"> </w:t>
       </w:r>
-      <w:proofErr w:type="spellStart"/>
       <w:r>
         <w:rPr>
           <w:lang w:val="en-US"/>
         </w:rPr>
         <w:t>quadrat</w:t>
       </w:r>
-      <w:proofErr w:type="spellEnd"/>
-      <w:r>
-        <w:rPr>
-          <w:lang w:val="en-US"/>
-        </w:rPr>
-        <w:t xml:space="preserve"> ad, </w:t>
-      </w:r>
-      <w:proofErr w:type="spellStart"/>
-      <w:r>
-        <w:rPr>
-          <w:lang w:val="en-US"/>
-        </w:rPr>
-        <w:t>porro</w:t>
-      </w:r>
-      <w:proofErr w:type="spellEnd"/>
+      <w:r>
+        <w:rPr>
+          <w:lang w:val="en-US"/>
+        </w:rPr>
+        <w:t xml:space="preserve"> ad, porro </w:t>
+      </w:r>
+      <w:r>
+        <w:rPr>
+          <w:lang w:val="en-US"/>
+        </w:rPr>
+        <w:t>similitude</w:t>
+      </w:r>
       <w:r>
         <w:rPr>
           <w:lang w:val="en-US"/>
@@ -2358,7 +2287,7 @@
         <w:rPr>
           <w:lang w:val="en-US"/>
         </w:rPr>
-        <w:t>similitude</w:t>
+        <w:t>sent</w:t>
       </w:r>
       <w:r>
         <w:rPr>
@@ -2370,27 +2299,7 @@
         <w:rPr>
           <w:lang w:val="en-US"/>
         </w:rPr>
-        <w:t>sent</w:t>
-      </w:r>
-      <w:r>
-        <w:rPr>
-          <w:lang w:val="en-US"/>
-        </w:rPr>
-        <w:t xml:space="preserve"> </w:t>
-      </w:r>
-      <w:proofErr w:type="spellStart"/>
-      <w:r>
-        <w:rPr>
-          <w:lang w:val="en-US"/>
-        </w:rPr>
-        <w:t>Quis</w:t>
-      </w:r>
-      <w:proofErr w:type="spellEnd"/>
-      <w:r>
-        <w:rPr>
-          <w:lang w:val="en-US"/>
-        </w:rPr>
-        <w:t xml:space="preserve"> Quam</w:t>
+        <w:t>Quis Quam</w:t>
       </w:r>
       <w:r>
         <w:rPr>
@@ -2682,27 +2591,18 @@
     <w:p>
       <w:pPr>
         <w:pStyle w:val="afe"/>
-        <w:rPr>
-          <w:lang w:val="en-US"/>
-        </w:rPr>
       </w:pPr>
       <w:r>
         <w:lastRenderedPageBreak/>
         <w:t>Продолжение</w:t>
       </w:r>
       <w:r>
-        <w:rPr>
-          <w:lang w:val="en-US"/>
-        </w:rPr>
         <w:t xml:space="preserve"> </w:t>
       </w:r>
       <w:r>
         <w:t>листинга</w:t>
       </w:r>
       <w:r>
-        <w:rPr>
-          <w:lang w:val="en-US"/>
-        </w:rPr>
         <w:t xml:space="preserve"> 1.1</w:t>
       </w:r>
     </w:p>
@@ -3745,25 +3645,21 @@
           <w:lang w:val="en-US"/>
         </w:rPr>
       </w:pPr>
-      <w:proofErr w:type="spellStart"/>
       <w:r>
         <w:rPr>
           <w:lang w:val="en-US"/>
         </w:rPr>
         <w:t>Lorem</w:t>
       </w:r>
-      <w:proofErr w:type="spellEnd"/>
       <w:r>
         <w:t xml:space="preserve">, </w:t>
       </w:r>
-      <w:proofErr w:type="spellStart"/>
       <w:r>
         <w:rPr>
           <w:lang w:val="en-US"/>
         </w:rPr>
         <w:t>ipsum</w:t>
       </w:r>
-      <w:proofErr w:type="spellEnd"/>
       <w:r>
         <w:t xml:space="preserve"> </w:t>
       </w:r>
@@ -3821,28 +3717,18 @@
       <w:r>
         <w:t xml:space="preserve">. </w:t>
       </w:r>
-      <w:proofErr w:type="spellStart"/>
-      <w:r>
-        <w:rPr>
-          <w:lang w:val="en-US"/>
-        </w:rPr>
-        <w:t>Est</w:t>
-      </w:r>
-      <w:proofErr w:type="spellEnd"/>
-      <w:r>
-        <w:rPr>
-          <w:lang w:val="en-US"/>
-        </w:rPr>
-        <w:t xml:space="preserve"> </w:t>
-      </w:r>
-      <w:proofErr w:type="spellStart"/>
+      <w:r>
+        <w:rPr>
+          <w:lang w:val="en-US"/>
+        </w:rPr>
+        <w:t xml:space="preserve">Est </w:t>
+      </w:r>
       <w:r>
         <w:rPr>
           <w:lang w:val="en-US"/>
         </w:rPr>
         <w:t>eques</w:t>
       </w:r>
-      <w:proofErr w:type="spellEnd"/>
       <w:r>
         <w:rPr>
           <w:lang w:val="en-US"/>
@@ -4237,14 +4123,27 @@
           <w:ind w:firstLine="0"/>
           <w:jc w:val="center"/>
         </w:pPr>
-        <w:fldSimple w:instr="PAGE   \* MERGEFORMAT">
-          <w:r>
-            <w:rPr>
-              <w:noProof/>
-            </w:rPr>
-            <w:t>11</w:t>
-          </w:r>
-        </w:fldSimple>
+        <w:r>
+          <w:fldChar w:fldCharType="begin"/>
+        </w:r>
+        <w:r>
+          <w:instrText>PAGE   \* MERGEFORMAT</w:instrText>
+        </w:r>
+        <w:r>
+          <w:fldChar w:fldCharType="separate"/>
+        </w:r>
+        <w:r>
+          <w:rPr>
+            <w:noProof/>
+          </w:rPr>
+          <w:t>9</w:t>
+        </w:r>
+        <w:r>
+          <w:rPr>
+            <w:noProof/>
+          </w:rPr>
+          <w:fldChar w:fldCharType="end"/>
+        </w:r>
       </w:p>
     </w:sdtContent>
   </w:sdt>
@@ -5962,10 +5861,11 @@
     <w:link w:val="10"/>
     <w:uiPriority w:val="9"/>
     <w:qFormat/>
-    <w:rsid w:val="00012BD7"/>
+    <w:rsid w:val="00DF4E48"/>
     <w:pPr>
       <w:keepNext/>
       <w:keepLines/>
+      <w:suppressAutoHyphens/>
       <w:spacing w:before="360" w:after="80"/>
       <w:outlineLvl w:val="0"/>
     </w:pPr>
@@ -5983,10 +5883,11 @@
     <w:uiPriority w:val="9"/>
     <w:unhideWhenUsed/>
     <w:qFormat/>
-    <w:rsid w:val="001C1AE1"/>
+    <w:rsid w:val="00DF4E48"/>
     <w:pPr>
       <w:keepNext/>
       <w:keepLines/>
+      <w:suppressAutoHyphens/>
       <w:spacing w:before="160" w:after="80"/>
       <w:outlineLvl w:val="1"/>
     </w:pPr>
@@ -6004,10 +5905,11 @@
     <w:uiPriority w:val="9"/>
     <w:unhideWhenUsed/>
     <w:qFormat/>
-    <w:rsid w:val="00A5455C"/>
+    <w:rsid w:val="00DF4E48"/>
     <w:pPr>
       <w:keepNext/>
       <w:keepLines/>
+      <w:suppressAutoHyphens/>
       <w:spacing w:before="160" w:after="80"/>
       <w:outlineLvl w:val="2"/>
     </w:pPr>
@@ -6025,10 +5927,11 @@
     <w:uiPriority w:val="9"/>
     <w:unhideWhenUsed/>
     <w:qFormat/>
-    <w:rsid w:val="00AD52B0"/>
+    <w:rsid w:val="00DF4E48"/>
     <w:pPr>
       <w:keepNext/>
       <w:keepLines/>
+      <w:suppressAutoHyphens/>
       <w:spacing w:before="80" w:after="40"/>
       <w:outlineLvl w:val="3"/>
     </w:pPr>
@@ -6179,7 +6082,7 @@
     <w:basedOn w:val="a3"/>
     <w:link w:val="1"/>
     <w:uiPriority w:val="9"/>
-    <w:rsid w:val="00012BD7"/>
+    <w:rsid w:val="00DF4E48"/>
     <w:rPr>
       <w:rFonts w:ascii="Times New Roman" w:eastAsiaTheme="majorEastAsia" w:hAnsi="Times New Roman" w:cstheme="majorBidi"/>
       <w:b/>
@@ -6192,7 +6095,7 @@
     <w:basedOn w:val="a3"/>
     <w:link w:val="2"/>
     <w:uiPriority w:val="9"/>
-    <w:rsid w:val="001C1AE1"/>
+    <w:rsid w:val="00DF4E48"/>
     <w:rPr>
       <w:rFonts w:ascii="Times New Roman" w:eastAsiaTheme="majorEastAsia" w:hAnsi="Times New Roman" w:cstheme="majorBidi"/>
       <w:b/>
@@ -6205,7 +6108,7 @@
     <w:basedOn w:val="a3"/>
     <w:link w:val="3"/>
     <w:uiPriority w:val="9"/>
-    <w:rsid w:val="00A5455C"/>
+    <w:rsid w:val="00DF4E48"/>
     <w:rPr>
       <w:rFonts w:ascii="Times New Roman" w:eastAsiaTheme="majorEastAsia" w:hAnsi="Times New Roman" w:cstheme="majorBidi"/>
       <w:b/>
@@ -6218,7 +6121,7 @@
     <w:basedOn w:val="a3"/>
     <w:link w:val="4"/>
     <w:uiPriority w:val="9"/>
-    <w:rsid w:val="00AD52B0"/>
+    <w:rsid w:val="00DF4E48"/>
     <w:rPr>
       <w:rFonts w:ascii="Times New Roman" w:eastAsiaTheme="majorEastAsia" w:hAnsi="Times New Roman" w:cstheme="majorBidi"/>
       <w:b/>
@@ -6689,8 +6592,8 @@
       <w:szCs w:val="18"/>
     </w:rPr>
   </w:style>
-  <w:style w:type="character" w:customStyle="1" w:styleId="UnresolvedMention">
-    <w:name w:val="Unresolved Mention"/>
+  <w:style w:type="character" w:customStyle="1" w:styleId="12">
+    <w:name w:val="Неразрешенное упоминание1"/>
     <w:basedOn w:val="a3"/>
     <w:uiPriority w:val="99"/>
     <w:semiHidden/>
@@ -6786,8 +6689,9 @@
     <w:next w:val="a2"/>
     <w:link w:val="00"/>
     <w:qFormat/>
-    <w:rsid w:val="0071225F"/>
+    <w:rsid w:val="00DF4E48"/>
     <w:pPr>
+      <w:suppressAutoHyphens/>
       <w:ind w:firstLine="0"/>
       <w:jc w:val="center"/>
     </w:pPr>
@@ -6812,7 +6716,7 @@
     <w:name w:val="Заголовок 0 Знак"/>
     <w:basedOn w:val="a3"/>
     <w:link w:val="0"/>
-    <w:rsid w:val="0071225F"/>
+    <w:rsid w:val="00DF4E48"/>
     <w:rPr>
       <w:rFonts w:ascii="Times New Roman" w:hAnsi="Times New Roman"/>
       <w:b/>
@@ -6846,6 +6750,8 @@
     <w:link w:val="aff0"/>
     <w:rsid w:val="00A26E0D"/>
     <w:rPr>
+      <w:rFonts w:ascii="Times New Roman" w:hAnsi="Times New Roman"/>
+      <w:sz w:val="28"/>
       <w:lang w:val="en-US" w:eastAsia="ru-RU"/>
     </w:rPr>
   </w:style>
@@ -6891,6 +6797,10 @@
     <w:basedOn w:val="aa"/>
     <w:link w:val="a"/>
     <w:rsid w:val="00D8402D"/>
+    <w:rPr>
+      <w:rFonts w:ascii="Times New Roman" w:hAnsi="Times New Roman"/>
+      <w:sz w:val="28"/>
+    </w:rPr>
   </w:style>
   <w:style w:type="paragraph" w:customStyle="1" w:styleId="aff5">
     <w:name w:val="Таблица_Подпись"/>
@@ -6898,10 +6808,10 @@
     <w:next w:val="a2"/>
     <w:link w:val="aff6"/>
     <w:qFormat/>
-    <w:rsid w:val="00D25F98"/>
+    <w:rsid w:val="008D4793"/>
     <w:pPr>
       <w:keepNext/>
-      <w:spacing w:line="240" w:lineRule="auto"/>
+      <w:spacing w:after="0" w:line="240" w:lineRule="auto"/>
       <w:ind w:firstLine="0"/>
     </w:pPr>
   </w:style>
@@ -6909,7 +6819,7 @@
     <w:name w:val="Таблица_Подпись Знак"/>
     <w:basedOn w:val="aff"/>
     <w:link w:val="aff5"/>
-    <w:rsid w:val="00D25F98"/>
+    <w:rsid w:val="008D4793"/>
   </w:style>
 </w:styles>
 </file>
@@ -7214,7 +7124,7 @@
 </file>
 
 <file path=customXml/itemProps1.xml><?xml version="1.0" encoding="utf-8"?>
-<ds:datastoreItem xmlns:ds="http://schemas.openxmlformats.org/officeDocument/2006/customXml" ds:itemID="{E5F61606-74E4-4453-9385-372664976D96}">
+<ds:datastoreItem xmlns:ds="http://schemas.openxmlformats.org/officeDocument/2006/customXml" ds:itemID="{42A9A55A-6A79-4830-83E2-D35131333E93}">
   <ds:schemaRefs>
     <ds:schemaRef ds:uri="http://schemas.openxmlformats.org/officeDocument/2006/bibliography"/>
   </ds:schemaRefs>

</xml_diff>

<commit_message>
add appendix to doc example
</commit_message>
<xml_diff>
--- a/resources/gost_example.docx
+++ b/resources/gost_example.docx
@@ -2394,6 +2394,7 @@
     <w:p>
       <w:pPr>
         <w:keepNext/>
+        <w:spacing w:line="240" w:lineRule="auto"/>
         <w:ind w:firstLine="0"/>
         <w:jc w:val="center"/>
         <w:rPr>
@@ -2426,7 +2427,7 @@
                     <a:blip r:embed="rId9" cstate="print">
                       <a:extLst>
                         <a:ext uri="{28A0092B-C50C-407E-A947-70E740481C1C}">
-                          <a14:useLocalDpi xmlns="" xmlns:wpc="http://schemas.microsoft.com/office/word/2010/wordprocessingCanvas" xmlns:cx="http://schemas.microsoft.com/office/drawing/2014/chartex" xmlns:cx1="http://schemas.microsoft.com/office/drawing/2015/9/8/chartex" xmlns:cx2="http://schemas.microsoft.com/office/drawing/2015/10/21/chartex" xmlns:cx3="http://schemas.microsoft.com/office/drawing/2016/5/9/chartex" xmlns:cx4="http://schemas.microsoft.com/office/drawing/2016/5/10/chartex" xmlns:cx5="http://schemas.microsoft.com/office/drawing/2016/5/11/chartex" xmlns:cx6="http://schemas.microsoft.com/office/drawing/2016/5/12/chartex" xmlns:cx7="http://schemas.microsoft.com/office/drawing/2016/5/13/chartex" xmlns:cx8="http://schemas.microsoft.com/office/drawing/2016/5/14/chartex" xmlns:mc="http://schemas.openxmlformats.org/markup-compatibility/2006" xmlns:aink="http://schemas.microsoft.com/office/drawing/2016/ink" xmlns:am3d="http://schemas.microsoft.com/office/drawing/2017/model3d" xmlns:o="urn:schemas-microsoft-com:office:office" xmlns:oel="http://schemas.microsoft.com/office/2019/extlst" xmlns:v="urn:schemas-microsoft-com:vml" xmlns:wp14="http://schemas.microsoft.com/office/word/2010/wordprocessingDrawing" xmlns:w10="urn:schemas-microsoft-com:office:word" xmlns:w="http://schemas.openxmlformats.org/wordprocessingml/2006/main" xmlns:w14="http://schemas.microsoft.com/office/word/2010/wordml" xmlns:w15="http://schemas.microsoft.com/office/word/2012/wordml" xmlns:w16cex="http://schemas.microsoft.com/office/word/2018/wordml/cex" xmlns:w16cid="http://schemas.microsoft.com/office/word/2016/wordml/cid" xmlns:w16="http://schemas.microsoft.com/office/word/2018/wordml" xmlns:w16du="http://schemas.microsoft.com/office/word/2023/wordml/word16du" xmlns:w16sdtdh="http://schemas.microsoft.com/office/word/2020/wordml/sdtdatahash" xmlns:w16sdtfl="http://schemas.microsoft.com/office/word/2024/wordml/sdtformatlock" xmlns:w16se="http://schemas.microsoft.com/office/word/2015/wordml/symex" xmlns:wpg="http://schemas.microsoft.com/office/word/2010/wordprocessingGroup" xmlns:wpi="http://schemas.microsoft.com/office/word/2010/wordprocessingInk" xmlns:wps="http://schemas.microsoft.com/office/word/2010/wordprocessingShape" xmlns:a14="http://schemas.microsoft.com/office/drawing/2010/main" val="0"/>
+                          <a14:useLocalDpi xmlns:a14="http://schemas.microsoft.com/office/drawing/2010/main" xmlns:wps="http://schemas.microsoft.com/office/word/2010/wordprocessingShape" xmlns:wpi="http://schemas.microsoft.com/office/word/2010/wordprocessingInk" xmlns:wpg="http://schemas.microsoft.com/office/word/2010/wordprocessingGroup" xmlns:w16se="http://schemas.microsoft.com/office/word/2015/wordml/symex" xmlns:w16sdtfl="http://schemas.microsoft.com/office/word/2024/wordml/sdtformatlock" xmlns:w16sdtdh="http://schemas.microsoft.com/office/word/2020/wordml/sdtdatahash" xmlns:w16du="http://schemas.microsoft.com/office/word/2023/wordml/word16du" xmlns:w16="http://schemas.microsoft.com/office/word/2018/wordml" xmlns:w16cid="http://schemas.microsoft.com/office/word/2016/wordml/cid" xmlns:w16cex="http://schemas.microsoft.com/office/word/2018/wordml/cex" xmlns:w15="http://schemas.microsoft.com/office/word/2012/wordml" xmlns:w14="http://schemas.microsoft.com/office/word/2010/wordml" xmlns:w="http://schemas.openxmlformats.org/wordprocessingml/2006/main" xmlns:w10="urn:schemas-microsoft-com:office:word" xmlns:wp14="http://schemas.microsoft.com/office/word/2010/wordprocessingDrawing" xmlns:v="urn:schemas-microsoft-com:vml" xmlns:oel="http://schemas.microsoft.com/office/2019/extlst" xmlns:o="urn:schemas-microsoft-com:office:office" xmlns:am3d="http://schemas.microsoft.com/office/drawing/2017/model3d" xmlns:aink="http://schemas.microsoft.com/office/drawing/2016/ink" xmlns:mc="http://schemas.openxmlformats.org/markup-compatibility/2006" xmlns:cx8="http://schemas.microsoft.com/office/drawing/2016/5/14/chartex" xmlns:cx7="http://schemas.microsoft.com/office/drawing/2016/5/13/chartex" xmlns:cx6="http://schemas.microsoft.com/office/drawing/2016/5/12/chartex" xmlns:cx5="http://schemas.microsoft.com/office/drawing/2016/5/11/chartex" xmlns:cx4="http://schemas.microsoft.com/office/drawing/2016/5/10/chartex" xmlns:cx3="http://schemas.microsoft.com/office/drawing/2016/5/9/chartex" xmlns:cx2="http://schemas.microsoft.com/office/drawing/2015/10/21/chartex" xmlns:cx1="http://schemas.microsoft.com/office/drawing/2015/9/8/chartex" xmlns:cx="http://schemas.microsoft.com/office/drawing/2014/chartex" xmlns:wpc="http://schemas.microsoft.com/office/word/2010/wordprocessingCanvas" xmlns="" val="0"/>
                         </a:ext>
                       </a:extLst>
                     </a:blip>
@@ -4058,8 +4059,1400 @@
         <w:t>).</w:t>
       </w:r>
     </w:p>
+    <w:p>
+      <w:pPr>
+        <w:spacing w:line="259" w:lineRule="auto"/>
+        <w:ind w:firstLine="0"/>
+        <w:jc w:val="left"/>
+        <w:rPr>
+          <w:lang w:val="en-US"/>
+        </w:rPr>
+      </w:pPr>
+      <w:r>
+        <w:rPr>
+          <w:lang w:val="en-US"/>
+        </w:rPr>
+        <w:br w:type="page"/>
+      </w:r>
+    </w:p>
+    <w:p>
+      <w:pPr>
+        <w:pStyle w:val="1"/>
+      </w:pPr>
+      <w:r>
+        <w:lastRenderedPageBreak/>
+        <w:t>ПРИЛОЖЕНИЯ</w:t>
+      </w:r>
+    </w:p>
+    <w:p>
+      <w:pPr>
+        <w:spacing w:after="0"/>
+      </w:pPr>
+      <w:r>
+        <w:t>Приложение А. Содержание файла CMakeLists.txt</w:t>
+      </w:r>
+    </w:p>
+    <w:p>
+      <w:pPr>
+        <w:spacing w:after="0"/>
+      </w:pPr>
+      <w:r>
+        <w:t xml:space="preserve">Приложение Б. </w:t>
+      </w:r>
+      <w:r>
+        <w:t xml:space="preserve">Графический материал </w:t>
+      </w:r>
+    </w:p>
+    <w:p>
+      <w:pPr>
+        <w:spacing w:after="0"/>
+      </w:pPr>
+      <w:r>
+        <w:t>Приложение В. Исходный код модульных тестов</w:t>
+      </w:r>
+    </w:p>
+    <w:p>
+      <w:pPr>
+        <w:spacing w:after="0"/>
+      </w:pPr>
+      <w:r>
+        <w:t>Приложение Г. Содержание</w:t>
+      </w:r>
+    </w:p>
+    <w:p>
+      <w:pPr>
+        <w:spacing w:after="0"/>
+      </w:pPr>
+      <w:r>
+        <w:t xml:space="preserve">Приложение Д. </w:t>
+      </w:r>
+      <w:r>
+        <w:t>Исходный код подсистемы «Перехватчик»</w:t>
+      </w:r>
+    </w:p>
+    <w:p>
+      <w:pPr>
+        <w:spacing w:line="259" w:lineRule="auto"/>
+        <w:ind w:firstLine="0"/>
+        <w:jc w:val="left"/>
+      </w:pPr>
+      <w:r>
+        <w:br w:type="page"/>
+      </w:r>
+    </w:p>
+    <w:p>
+      <w:pPr>
+        <w:pStyle w:val="0"/>
+        <w:spacing w:after="0"/>
+      </w:pPr>
+      <w:r>
+        <w:lastRenderedPageBreak/>
+        <w:t>ПРИЛОЖЕНИЕ А</w:t>
+      </w:r>
+    </w:p>
+    <w:p>
+      <w:pPr>
+        <w:ind w:firstLine="0"/>
+        <w:jc w:val="center"/>
+      </w:pPr>
+      <w:r>
+        <w:t>Содержание файла CMakeLists.txt</w:t>
+      </w:r>
+    </w:p>
+    <w:p>
+      <w:pPr>
+        <w:pStyle w:val="ListingCaption"/>
+      </w:pPr>
+      <w:r>
+        <w:t xml:space="preserve">Листинг 1.1 – </w:t>
+      </w:r>
+      <w:r>
+        <w:t>Файл кон</w:t>
+      </w:r>
+      <w:r>
+        <w:t>фигурации сборки CMakeLists.txt</w:t>
+      </w:r>
+    </w:p>
+    <w:p>
+      <w:pPr>
+        <w:pStyle w:val="ListingCode"/>
+        <w:rPr>
+          <w:lang w:val="ru-RU"/>
+        </w:rPr>
+      </w:pPr>
+      <w:r>
+        <w:rPr>
+          <w:lang w:val="ru-RU"/>
+        </w:rPr>
+        <w:t xml:space="preserve"># Установка минимальной версии </w:t>
+      </w:r>
+      <w:proofErr w:type="spellStart"/>
+      <w:r>
+        <w:t>CMake</w:t>
+      </w:r>
+      <w:proofErr w:type="spellEnd"/>
+    </w:p>
+    <w:p>
+      <w:pPr>
+        <w:pStyle w:val="ListingCode"/>
+        <w:rPr>
+          <w:lang w:val="ru-RU"/>
+        </w:rPr>
+      </w:pPr>
+      <w:proofErr w:type="spellStart"/>
+      <w:r>
+        <w:t>cmake</w:t>
+      </w:r>
+      <w:proofErr w:type="spellEnd"/>
+      <w:r>
+        <w:rPr>
+          <w:lang w:val="ru-RU"/>
+        </w:rPr>
+        <w:t>_</w:t>
+      </w:r>
+      <w:r>
+        <w:t>minimum</w:t>
+      </w:r>
+      <w:r>
+        <w:rPr>
+          <w:lang w:val="ru-RU"/>
+        </w:rPr>
+        <w:t>_</w:t>
+      </w:r>
+      <w:proofErr w:type="gramStart"/>
+      <w:r>
+        <w:t>required</w:t>
+      </w:r>
+      <w:r>
+        <w:rPr>
+          <w:lang w:val="ru-RU"/>
+        </w:rPr>
+        <w:t>(</w:t>
+      </w:r>
+      <w:proofErr w:type="gramEnd"/>
+      <w:r>
+        <w:t>VERSION</w:t>
+      </w:r>
+      <w:r>
+        <w:rPr>
+          <w:lang w:val="ru-RU"/>
+        </w:rPr>
+        <w:t xml:space="preserve"> 3.16)</w:t>
+      </w:r>
+    </w:p>
+    <w:p>
+      <w:pPr>
+        <w:pStyle w:val="ListingCode"/>
+        <w:rPr>
+          <w:lang w:val="ru-RU"/>
+        </w:rPr>
+      </w:pPr>
+    </w:p>
+    <w:p>
+      <w:pPr>
+        <w:pStyle w:val="ListingCode"/>
+        <w:rPr>
+          <w:lang w:val="ru-RU"/>
+        </w:rPr>
+      </w:pPr>
+      <w:r>
+        <w:rPr>
+          <w:lang w:val="ru-RU"/>
+        </w:rPr>
+        <w:t># Название проекта и версия</w:t>
+      </w:r>
+    </w:p>
+    <w:p>
+      <w:pPr>
+        <w:pStyle w:val="ListingCode"/>
+      </w:pPr>
+      <w:proofErr w:type="gramStart"/>
+      <w:r>
+        <w:t>project(</w:t>
+      </w:r>
+      <w:proofErr w:type="spellStart"/>
+      <w:proofErr w:type="gramEnd"/>
+      <w:r>
+        <w:t>ImageProcessingAlgorithm</w:t>
+      </w:r>
+      <w:proofErr w:type="spellEnd"/>
+      <w:r>
+        <w:t xml:space="preserve"> VERSION 1.0.0 LANGUAGES CXX)</w:t>
+      </w:r>
+    </w:p>
+    <w:p>
+      <w:pPr>
+        <w:pStyle w:val="ListingCode"/>
+      </w:pPr>
+    </w:p>
+    <w:p>
+      <w:pPr>
+        <w:pStyle w:val="ListingCode"/>
+        <w:rPr>
+          <w:lang w:val="ru-RU"/>
+        </w:rPr>
+      </w:pPr>
+      <w:r>
+        <w:rPr>
+          <w:lang w:val="ru-RU"/>
+        </w:rPr>
+        <w:t xml:space="preserve"># Установка стандарта </w:t>
+      </w:r>
+      <w:r>
+        <w:t>C</w:t>
+      </w:r>
+      <w:r>
+        <w:rPr>
+          <w:lang w:val="ru-RU"/>
+        </w:rPr>
+        <w:t>++ (требование для современных компиляторов)</w:t>
+      </w:r>
+    </w:p>
+    <w:p>
+      <w:pPr>
+        <w:pStyle w:val="ListingCode"/>
+      </w:pPr>
+      <w:proofErr w:type="gramStart"/>
+      <w:r>
+        <w:t>set(</w:t>
+      </w:r>
+      <w:proofErr w:type="gramEnd"/>
+      <w:r>
+        <w:t>CMAKE_CXX_STANDARD 17)</w:t>
+      </w:r>
+    </w:p>
+    <w:p>
+      <w:pPr>
+        <w:pStyle w:val="ListingCode"/>
+      </w:pPr>
+      <w:proofErr w:type="gramStart"/>
+      <w:r>
+        <w:t>set(</w:t>
+      </w:r>
+      <w:proofErr w:type="gramEnd"/>
+      <w:r>
+        <w:t>CMAKE_CXX_STANDARD_REQUIRED ON)</w:t>
+      </w:r>
+    </w:p>
+    <w:p>
+      <w:pPr>
+        <w:pStyle w:val="ListingCode"/>
+      </w:pPr>
+      <w:proofErr w:type="gramStart"/>
+      <w:r>
+        <w:t>set(</w:t>
+      </w:r>
+      <w:proofErr w:type="gramEnd"/>
+      <w:r>
+        <w:t>CMAKE_CXX_EXTENSIONS OFF)</w:t>
+      </w:r>
+    </w:p>
+    <w:p>
+      <w:pPr>
+        <w:pStyle w:val="ListingCode"/>
+      </w:pPr>
+    </w:p>
+    <w:p>
+      <w:pPr>
+        <w:pStyle w:val="ListingCode"/>
+        <w:rPr>
+          <w:lang w:val="ru-RU"/>
+        </w:rPr>
+      </w:pPr>
+      <w:r>
+        <w:rPr>
+          <w:lang w:val="ru-RU"/>
+        </w:rPr>
+        <w:t xml:space="preserve"># Определение типа сборки по умолчанию, если не </w:t>
+      </w:r>
+      <w:proofErr w:type="gramStart"/>
+      <w:r>
+        <w:rPr>
+          <w:lang w:val="ru-RU"/>
+        </w:rPr>
+        <w:t>задан</w:t>
+      </w:r>
+      <w:proofErr w:type="gramEnd"/>
+    </w:p>
+    <w:p>
+      <w:pPr>
+        <w:pStyle w:val="ListingCode"/>
+      </w:pPr>
+      <w:proofErr w:type="gramStart"/>
+      <w:r>
+        <w:t>if(</w:t>
+      </w:r>
+      <w:proofErr w:type="gramEnd"/>
+      <w:r>
+        <w:t>NOT CMAKE_BUILD_TYPE)</w:t>
+      </w:r>
+    </w:p>
+    <w:p>
+      <w:pPr>
+        <w:pStyle w:val="ListingCode"/>
+      </w:pPr>
+      <w:r>
+        <w:t xml:space="preserve">    </w:t>
+      </w:r>
+      <w:proofErr w:type="gramStart"/>
+      <w:r>
+        <w:t>set(</w:t>
+      </w:r>
+      <w:proofErr w:type="gramEnd"/>
+      <w:r>
+        <w:t>CMAKE_BUILD_TYPE "Release")</w:t>
+      </w:r>
+    </w:p>
+    <w:p>
+      <w:pPr>
+        <w:pStyle w:val="ListingCode"/>
+        <w:rPr>
+          <w:lang w:val="ru-RU"/>
+        </w:rPr>
+      </w:pPr>
+      <w:proofErr w:type="spellStart"/>
+      <w:proofErr w:type="gramStart"/>
+      <w:r>
+        <w:t>endif</w:t>
+      </w:r>
+      <w:proofErr w:type="spellEnd"/>
+      <w:r>
+        <w:rPr>
+          <w:lang w:val="ru-RU"/>
+        </w:rPr>
+        <w:t>()</w:t>
+      </w:r>
+      <w:proofErr w:type="gramEnd"/>
+    </w:p>
+    <w:p>
+      <w:pPr>
+        <w:pStyle w:val="ListingCode"/>
+        <w:rPr>
+          <w:lang w:val="ru-RU"/>
+        </w:rPr>
+      </w:pPr>
+    </w:p>
+    <w:p>
+      <w:pPr>
+        <w:pStyle w:val="ListingCode"/>
+        <w:rPr>
+          <w:lang w:val="ru-RU"/>
+        </w:rPr>
+      </w:pPr>
+      <w:r>
+        <w:rPr>
+          <w:lang w:val="ru-RU"/>
+        </w:rPr>
+        <w:t># Опции сборки (флаги компилятора)</w:t>
+      </w:r>
+    </w:p>
+    <w:p>
+      <w:pPr>
+        <w:pStyle w:val="ListingCode"/>
+      </w:pPr>
+      <w:proofErr w:type="gramStart"/>
+      <w:r>
+        <w:t>if(</w:t>
+      </w:r>
+      <w:proofErr w:type="gramEnd"/>
+      <w:r>
+        <w:t>CMAKE_CXX_COMPILER_ID MATCHES "</w:t>
+      </w:r>
+      <w:proofErr w:type="spellStart"/>
+      <w:r>
+        <w:t>GNU|Clang|MSVC</w:t>
+      </w:r>
+      <w:proofErr w:type="spellEnd"/>
+      <w:r>
+        <w:t>")</w:t>
+      </w:r>
+    </w:p>
+    <w:p>
+      <w:pPr>
+        <w:pStyle w:val="ListingCode"/>
+      </w:pPr>
+      <w:r>
+        <w:t xml:space="preserve">    </w:t>
+      </w:r>
+      <w:proofErr w:type="gramStart"/>
+      <w:r>
+        <w:t>if(</w:t>
+      </w:r>
+      <w:proofErr w:type="gramEnd"/>
+      <w:r>
+        <w:t>CMAKE_BUILD_TYPE STREQUAL "Debug")</w:t>
+      </w:r>
+    </w:p>
+    <w:p>
+      <w:pPr>
+        <w:pStyle w:val="ListingCode"/>
+      </w:pPr>
+      <w:r>
+        <w:t xml:space="preserve">        </w:t>
+      </w:r>
+      <w:proofErr w:type="spellStart"/>
+      <w:r>
+        <w:t>add_compile_</w:t>
+      </w:r>
+      <w:proofErr w:type="gramStart"/>
+      <w:r>
+        <w:t>options</w:t>
+      </w:r>
+      <w:proofErr w:type="spellEnd"/>
+      <w:r>
+        <w:t>(</w:t>
+      </w:r>
+      <w:proofErr w:type="gramEnd"/>
+      <w:r>
+        <w:t>-Wall -</w:t>
+      </w:r>
+      <w:proofErr w:type="spellStart"/>
+      <w:r>
+        <w:t>Wextra</w:t>
+      </w:r>
+      <w:proofErr w:type="spellEnd"/>
+      <w:r>
+        <w:t xml:space="preserve"> -g -O0)</w:t>
+      </w:r>
+    </w:p>
+    <w:p>
+      <w:pPr>
+        <w:pStyle w:val="ListingCode"/>
+      </w:pPr>
+      <w:r>
+        <w:t xml:space="preserve">    </w:t>
+      </w:r>
+      <w:proofErr w:type="spellStart"/>
+      <w:proofErr w:type="gramStart"/>
+      <w:r>
+        <w:t>elseif</w:t>
+      </w:r>
+      <w:proofErr w:type="spellEnd"/>
+      <w:r>
+        <w:t>(</w:t>
+      </w:r>
+      <w:proofErr w:type="gramEnd"/>
+      <w:r>
+        <w:t>CMAKE_BUILD_TYPE STREQUAL "Release")</w:t>
+      </w:r>
+    </w:p>
+    <w:p>
+      <w:pPr>
+        <w:pStyle w:val="ListingCode"/>
+      </w:pPr>
+      <w:r>
+        <w:t xml:space="preserve">        </w:t>
+      </w:r>
+      <w:proofErr w:type="spellStart"/>
+      <w:r>
+        <w:t>add_compile_</w:t>
+      </w:r>
+      <w:proofErr w:type="gramStart"/>
+      <w:r>
+        <w:t>options</w:t>
+      </w:r>
+      <w:proofErr w:type="spellEnd"/>
+      <w:r>
+        <w:t>(</w:t>
+      </w:r>
+      <w:proofErr w:type="gramEnd"/>
+      <w:r>
+        <w:t>-O3 -DNDEBUG)</w:t>
+      </w:r>
+    </w:p>
+    <w:p>
+      <w:pPr>
+        <w:pStyle w:val="ListingCode"/>
+        <w:rPr>
+          <w:lang w:val="ru-RU"/>
+        </w:rPr>
+      </w:pPr>
+      <w:r>
+        <w:t xml:space="preserve">    </w:t>
+      </w:r>
+      <w:proofErr w:type="spellStart"/>
+      <w:proofErr w:type="gramStart"/>
+      <w:r>
+        <w:t>endif</w:t>
+      </w:r>
+      <w:proofErr w:type="spellEnd"/>
+      <w:r>
+        <w:rPr>
+          <w:lang w:val="ru-RU"/>
+        </w:rPr>
+        <w:t>()</w:t>
+      </w:r>
+      <w:proofErr w:type="gramEnd"/>
+    </w:p>
+    <w:p>
+      <w:pPr>
+        <w:pStyle w:val="ListingCode"/>
+        <w:rPr>
+          <w:lang w:val="ru-RU"/>
+        </w:rPr>
+      </w:pPr>
+      <w:proofErr w:type="spellStart"/>
+      <w:proofErr w:type="gramStart"/>
+      <w:r>
+        <w:t>endif</w:t>
+      </w:r>
+      <w:proofErr w:type="spellEnd"/>
+      <w:r>
+        <w:rPr>
+          <w:lang w:val="ru-RU"/>
+        </w:rPr>
+        <w:t>()</w:t>
+      </w:r>
+      <w:proofErr w:type="gramEnd"/>
+    </w:p>
+    <w:p>
+      <w:pPr>
+        <w:pStyle w:val="ListingCode"/>
+        <w:rPr>
+          <w:lang w:val="ru-RU"/>
+        </w:rPr>
+      </w:pPr>
+    </w:p>
+    <w:p>
+      <w:pPr>
+        <w:pStyle w:val="ListingCode"/>
+        <w:rPr>
+          <w:lang w:val="ru-RU"/>
+        </w:rPr>
+      </w:pPr>
+      <w:proofErr w:type="gramStart"/>
+      <w:r>
+        <w:rPr>
+          <w:lang w:val="ru-RU"/>
+        </w:rPr>
+        <w:t># Поиск внешней библиотеки (пример:</w:t>
+      </w:r>
+      <w:proofErr w:type="gramEnd"/>
+      <w:r>
+        <w:rPr>
+          <w:lang w:val="ru-RU"/>
+        </w:rPr>
+        <w:t xml:space="preserve"> </w:t>
+      </w:r>
+      <w:proofErr w:type="spellStart"/>
+      <w:r>
+        <w:t>OpenCV</w:t>
+      </w:r>
+      <w:proofErr w:type="spellEnd"/>
+      <w:r>
+        <w:rPr>
+          <w:lang w:val="ru-RU"/>
+        </w:rPr>
+        <w:t>)</w:t>
+      </w:r>
+    </w:p>
+    <w:p>
+      <w:pPr>
+        <w:pStyle w:val="ListingCode"/>
+      </w:pPr>
+      <w:proofErr w:type="spellStart"/>
+      <w:r>
+        <w:t>find_</w:t>
+      </w:r>
+      <w:proofErr w:type="gramStart"/>
+      <w:r>
+        <w:t>package</w:t>
+      </w:r>
+      <w:proofErr w:type="spellEnd"/>
+      <w:r>
+        <w:t>(</w:t>
+      </w:r>
+      <w:proofErr w:type="spellStart"/>
+      <w:proofErr w:type="gramEnd"/>
+      <w:r>
+        <w:t>OpenCV</w:t>
+      </w:r>
+      <w:proofErr w:type="spellEnd"/>
+      <w:r>
+        <w:t xml:space="preserve"> REQUIRED COMPONENTS core </w:t>
+      </w:r>
+      <w:proofErr w:type="spellStart"/>
+      <w:r>
+        <w:t>imgproc</w:t>
+      </w:r>
+      <w:proofErr w:type="spellEnd"/>
+      <w:r>
+        <w:t xml:space="preserve"> </w:t>
+      </w:r>
+      <w:proofErr w:type="spellStart"/>
+      <w:r>
+        <w:t>highgui</w:t>
+      </w:r>
+      <w:proofErr w:type="spellEnd"/>
+      <w:r>
+        <w:t>)</w:t>
+      </w:r>
+    </w:p>
+    <w:p>
+      <w:pPr>
+        <w:pStyle w:val="ListingCode"/>
+      </w:pPr>
+    </w:p>
+    <w:p>
+      <w:pPr>
+        <w:pStyle w:val="ListingCode"/>
+        <w:rPr>
+          <w:lang w:val="ru-RU"/>
+        </w:rPr>
+      </w:pPr>
+      <w:r>
+        <w:rPr>
+          <w:lang w:val="ru-RU"/>
+        </w:rPr>
+        <w:t xml:space="preserve"># Если </w:t>
+      </w:r>
+      <w:proofErr w:type="spellStart"/>
+      <w:r>
+        <w:t>OpenCV</w:t>
+      </w:r>
+      <w:proofErr w:type="spellEnd"/>
+      <w:r>
+        <w:rPr>
+          <w:lang w:val="ru-RU"/>
+        </w:rPr>
+        <w:t xml:space="preserve"> не </w:t>
+      </w:r>
+      <w:proofErr w:type="gramStart"/>
+      <w:r>
+        <w:rPr>
+          <w:lang w:val="ru-RU"/>
+        </w:rPr>
+        <w:t>найден</w:t>
+      </w:r>
+      <w:proofErr w:type="gramEnd"/>
+      <w:r>
+        <w:rPr>
+          <w:lang w:val="ru-RU"/>
+        </w:rPr>
+        <w:t xml:space="preserve"> – остановить сборку с ошибкой</w:t>
+      </w:r>
+    </w:p>
+    <w:p>
+      <w:pPr>
+        <w:pStyle w:val="ListingCode"/>
+      </w:pPr>
+      <w:proofErr w:type="gramStart"/>
+      <w:r>
+        <w:t>if(</w:t>
+      </w:r>
+      <w:proofErr w:type="gramEnd"/>
+      <w:r>
+        <w:t xml:space="preserve">NOT </w:t>
+      </w:r>
+      <w:proofErr w:type="spellStart"/>
+      <w:r>
+        <w:t>OpenCV_FOUND</w:t>
+      </w:r>
+      <w:proofErr w:type="spellEnd"/>
+      <w:r>
+        <w:t>)</w:t>
+      </w:r>
+    </w:p>
+    <w:p>
+      <w:pPr>
+        <w:pStyle w:val="ListingCode"/>
+        <w:rPr>
+          <w:lang w:val="ru-RU"/>
+        </w:rPr>
+      </w:pPr>
+      <w:r>
+        <w:t xml:space="preserve">    </w:t>
+      </w:r>
+      <w:proofErr w:type="gramStart"/>
+      <w:r>
+        <w:t>message(</w:t>
+      </w:r>
+      <w:proofErr w:type="gramEnd"/>
+      <w:r>
+        <w:t>FATAL_ERROR "</w:t>
+      </w:r>
+      <w:proofErr w:type="spellStart"/>
+      <w:r>
+        <w:t>OpenCV</w:t>
+      </w:r>
+      <w:proofErr w:type="spellEnd"/>
+      <w:r>
+        <w:t xml:space="preserve"> </w:t>
+      </w:r>
+      <w:proofErr w:type="spellStart"/>
+      <w:r>
+        <w:t>не</w:t>
+      </w:r>
+      <w:proofErr w:type="spellEnd"/>
+      <w:r>
+        <w:t xml:space="preserve"> </w:t>
+      </w:r>
+      <w:proofErr w:type="spellStart"/>
+      <w:r>
+        <w:t>найдена</w:t>
+      </w:r>
+      <w:proofErr w:type="spellEnd"/>
+      <w:r>
+        <w:t xml:space="preserve">. </w:t>
+      </w:r>
+      <w:proofErr w:type="gramStart"/>
+      <w:r>
+        <w:rPr>
+          <w:lang w:val="ru-RU"/>
+        </w:rPr>
+        <w:t xml:space="preserve">Установите </w:t>
+      </w:r>
+      <w:proofErr w:type="spellStart"/>
+      <w:r>
+        <w:t>OpenCV</w:t>
+      </w:r>
+      <w:proofErr w:type="spellEnd"/>
+      <w:r>
+        <w:rPr>
+          <w:lang w:val="ru-RU"/>
+        </w:rPr>
+        <w:t xml:space="preserve"> и укажите путь через </w:t>
+      </w:r>
+      <w:proofErr w:type="spellStart"/>
+      <w:r>
+        <w:t>OpenCV</w:t>
+      </w:r>
+      <w:proofErr w:type="spellEnd"/>
+      <w:r>
+        <w:rPr>
+          <w:lang w:val="ru-RU"/>
+        </w:rPr>
+        <w:t>_</w:t>
+      </w:r>
+      <w:r>
+        <w:t>DIR</w:t>
+      </w:r>
+      <w:r>
+        <w:rPr>
+          <w:lang w:val="ru-RU"/>
+        </w:rPr>
+        <w:t>.")</w:t>
+      </w:r>
+      <w:proofErr w:type="gramEnd"/>
+    </w:p>
+    <w:p>
+      <w:pPr>
+        <w:pStyle w:val="ListingCode"/>
+      </w:pPr>
+      <w:proofErr w:type="spellStart"/>
+      <w:proofErr w:type="gramStart"/>
+      <w:r>
+        <w:t>endif</w:t>
+      </w:r>
+      <w:proofErr w:type="spellEnd"/>
+      <w:r>
+        <w:t>()</w:t>
+      </w:r>
+      <w:proofErr w:type="gramEnd"/>
+    </w:p>
+    <w:p>
+      <w:pPr>
+        <w:pStyle w:val="ListingCode"/>
+      </w:pPr>
+    </w:p>
+    <w:p>
+      <w:pPr>
+        <w:pStyle w:val="ListingCode"/>
+      </w:pPr>
+      <w:r>
+        <w:t xml:space="preserve"># </w:t>
+      </w:r>
+      <w:proofErr w:type="spellStart"/>
+      <w:r>
+        <w:t>Добавление</w:t>
+      </w:r>
+      <w:proofErr w:type="spellEnd"/>
+      <w:r>
+        <w:t xml:space="preserve"> </w:t>
+      </w:r>
+      <w:proofErr w:type="spellStart"/>
+      <w:r>
+        <w:t>исходных</w:t>
+      </w:r>
+      <w:proofErr w:type="spellEnd"/>
+      <w:r>
+        <w:t xml:space="preserve"> </w:t>
+      </w:r>
+      <w:proofErr w:type="spellStart"/>
+      <w:r>
+        <w:t>файлов</w:t>
+      </w:r>
+      <w:proofErr w:type="spellEnd"/>
+      <w:r>
+        <w:t xml:space="preserve"> </w:t>
+      </w:r>
+      <w:proofErr w:type="spellStart"/>
+      <w:r>
+        <w:t>проекта</w:t>
+      </w:r>
+      <w:proofErr w:type="spellEnd"/>
+    </w:p>
+    <w:p>
+      <w:pPr>
+        <w:pStyle w:val="ListingCode"/>
+      </w:pPr>
+      <w:proofErr w:type="gramStart"/>
+      <w:r>
+        <w:t>set(</w:t>
+      </w:r>
+      <w:proofErr w:type="gramEnd"/>
+      <w:r>
+        <w:t>SOURCES</w:t>
+      </w:r>
+    </w:p>
+    <w:p>
+      <w:pPr>
+        <w:pStyle w:val="ListingCode"/>
+      </w:pPr>
+      <w:r>
+        <w:t xml:space="preserve">    </w:t>
+      </w:r>
+      <w:proofErr w:type="spellStart"/>
+      <w:proofErr w:type="gramStart"/>
+      <w:r>
+        <w:t>src</w:t>
+      </w:r>
+      <w:proofErr w:type="spellEnd"/>
+      <w:r>
+        <w:t>/main.cpp</w:t>
+      </w:r>
+      <w:proofErr w:type="gramEnd"/>
+    </w:p>
+    <w:p>
+      <w:pPr>
+        <w:pStyle w:val="ListingCode"/>
+      </w:pPr>
+      <w:r>
+        <w:t xml:space="preserve">    </w:t>
+      </w:r>
+      <w:proofErr w:type="spellStart"/>
+      <w:proofErr w:type="gramStart"/>
+      <w:r>
+        <w:t>src</w:t>
+      </w:r>
+      <w:proofErr w:type="spellEnd"/>
+      <w:r>
+        <w:t>/image_loader.cpp</w:t>
+      </w:r>
+      <w:proofErr w:type="gramEnd"/>
+    </w:p>
+    <w:p>
+      <w:pPr>
+        <w:pStyle w:val="ListingCode"/>
+      </w:pPr>
+      <w:r>
+        <w:t xml:space="preserve">    </w:t>
+      </w:r>
+      <w:proofErr w:type="spellStart"/>
+      <w:proofErr w:type="gramStart"/>
+      <w:r>
+        <w:t>src</w:t>
+      </w:r>
+      <w:proofErr w:type="spellEnd"/>
+      <w:r>
+        <w:t>/processor.cpp</w:t>
+      </w:r>
+      <w:proofErr w:type="gramEnd"/>
+    </w:p>
+    <w:p>
+      <w:pPr>
+        <w:pStyle w:val="ListingCode"/>
+      </w:pPr>
+      <w:r>
+        <w:t xml:space="preserve">    </w:t>
+      </w:r>
+      <w:proofErr w:type="spellStart"/>
+      <w:proofErr w:type="gramStart"/>
+      <w:r>
+        <w:t>src</w:t>
+      </w:r>
+      <w:proofErr w:type="spellEnd"/>
+      <w:r>
+        <w:t>/result_saver.cpp</w:t>
+      </w:r>
+      <w:proofErr w:type="gramEnd"/>
+    </w:p>
+    <w:p>
+      <w:pPr>
+        <w:pStyle w:val="ListingCode"/>
+        <w:rPr>
+          <w:lang w:val="ru-RU"/>
+        </w:rPr>
+      </w:pPr>
+      <w:r>
+        <w:t>)</w:t>
+      </w:r>
+    </w:p>
+    <w:p>
+      <w:pPr>
+        <w:pStyle w:val="ListingCode"/>
+        <w:rPr>
+          <w:lang w:val="ru-RU"/>
+        </w:rPr>
+      </w:pPr>
+    </w:p>
+    <w:p>
+      <w:pPr>
+        <w:spacing w:line="259" w:lineRule="auto"/>
+        <w:ind w:firstLine="0"/>
+        <w:jc w:val="left"/>
+      </w:pPr>
+      <w:r>
+        <w:br w:type="page"/>
+      </w:r>
+    </w:p>
+    <w:p>
+      <w:pPr>
+        <w:pStyle w:val="0"/>
+        <w:spacing w:after="0"/>
+      </w:pPr>
+      <w:r>
+        <w:lastRenderedPageBreak/>
+        <w:t>ПРИЛОЖЕНИЕ Б</w:t>
+      </w:r>
+    </w:p>
+    <w:p>
+      <w:pPr>
+        <w:ind w:firstLine="0"/>
+        <w:jc w:val="center"/>
+      </w:pPr>
+      <w:r>
+        <w:t>Графический материал</w:t>
+      </w:r>
+    </w:p>
+    <w:p>
+      <w:pPr>
+        <w:keepNext/>
+        <w:spacing w:line="240" w:lineRule="auto"/>
+        <w:ind w:firstLine="0"/>
+        <w:jc w:val="center"/>
+        <w:rPr>
+          <w:lang w:val="en-US"/>
+        </w:rPr>
+      </w:pPr>
+      <w:r>
+        <w:rPr>
+          <w:noProof/>
+          <w:lang w:eastAsia="ru-RU"/>
+        </w:rPr>
+        <w:drawing>
+          <wp:inline distT="0" distB="0" distL="0" distR="0">
+            <wp:extent cx="4591050" cy="2285741"/>
+            <wp:effectExtent l="19050" t="0" r="0" b="0"/>
+            <wp:docPr id="1" name="Рисунок 2"/>
+            <wp:cNvGraphicFramePr>
+              <a:graphicFrameLocks xmlns:a="http://schemas.openxmlformats.org/drawingml/2006/main" noChangeAspect="1"/>
+            </wp:cNvGraphicFramePr>
+            <a:graphic xmlns:a="http://schemas.openxmlformats.org/drawingml/2006/main">
+              <a:graphicData uri="http://schemas.openxmlformats.org/drawingml/2006/picture">
+                <pic:pic xmlns:pic="http://schemas.openxmlformats.org/drawingml/2006/picture">
+                  <pic:nvPicPr>
+                    <pic:cNvPr id="1233863608" name="Рисунок 2"/>
+                    <pic:cNvPicPr>
+                      <a:picLocks noChangeAspect="1" noChangeArrowheads="1"/>
+                    </pic:cNvPicPr>
+                  </pic:nvPicPr>
+                  <pic:blipFill>
+                    <a:blip r:embed="rId11" cstate="print"/>
+                    <a:stretch>
+                      <a:fillRect/>
+                    </a:stretch>
+                  </pic:blipFill>
+                  <pic:spPr bwMode="auto">
+                    <a:xfrm>
+                      <a:off x="0" y="0"/>
+                      <a:ext cx="4610527" cy="2295438"/>
+                    </a:xfrm>
+                    <a:prstGeom prst="rect">
+                      <a:avLst/>
+                    </a:prstGeom>
+                  </pic:spPr>
+                </pic:pic>
+              </a:graphicData>
+            </a:graphic>
+          </wp:inline>
+        </w:drawing>
+      </w:r>
+    </w:p>
+    <w:p>
+      <w:pPr>
+        <w:spacing w:line="240" w:lineRule="auto"/>
+        <w:ind w:firstLine="0"/>
+        <w:jc w:val="center"/>
+      </w:pPr>
+      <w:r>
+        <w:t>Рисунок</w:t>
+      </w:r>
+      <w:r>
+        <w:t xml:space="preserve"> </w:t>
+      </w:r>
+      <w:r>
+        <w:t>Б.1</w:t>
+      </w:r>
+      <w:r>
+        <w:t xml:space="preserve"> – </w:t>
+      </w:r>
+      <w:r>
+        <w:t>Обобщённая структурная схема алгоритма</w:t>
+      </w:r>
+    </w:p>
+    <w:p>
+      <w:pPr>
+        <w:keepNext/>
+        <w:spacing w:line="240" w:lineRule="auto"/>
+        <w:ind w:firstLine="0"/>
+        <w:jc w:val="center"/>
+        <w:rPr>
+          <w:lang w:val="en-US"/>
+        </w:rPr>
+      </w:pPr>
+      <w:r>
+        <w:rPr>
+          <w:noProof/>
+          <w:lang w:eastAsia="ru-RU"/>
+        </w:rPr>
+        <w:drawing>
+          <wp:inline distT="0" distB="0" distL="0" distR="0">
+            <wp:extent cx="4791075" cy="2095500"/>
+            <wp:effectExtent l="19050" t="0" r="9525" b="0"/>
+            <wp:docPr id="2" name="Рисунок 2"/>
+            <wp:cNvGraphicFramePr>
+              <a:graphicFrameLocks xmlns:a="http://schemas.openxmlformats.org/drawingml/2006/main" noChangeAspect="1"/>
+            </wp:cNvGraphicFramePr>
+            <a:graphic xmlns:a="http://schemas.openxmlformats.org/drawingml/2006/main">
+              <a:graphicData uri="http://schemas.openxmlformats.org/drawingml/2006/picture">
+                <pic:pic xmlns:pic="http://schemas.openxmlformats.org/drawingml/2006/picture">
+                  <pic:nvPicPr>
+                    <pic:cNvPr id="1233863608" name="Рисунок 2"/>
+                    <pic:cNvPicPr>
+                      <a:picLocks noChangeAspect="1" noChangeArrowheads="1"/>
+                    </pic:cNvPicPr>
+                  </pic:nvPicPr>
+                  <pic:blipFill>
+                    <a:blip r:embed="rId12" cstate="print"/>
+                    <a:srcRect b="5172"/>
+                    <a:stretch>
+                      <a:fillRect/>
+                    </a:stretch>
+                  </pic:blipFill>
+                  <pic:spPr bwMode="auto">
+                    <a:xfrm>
+                      <a:off x="0" y="0"/>
+                      <a:ext cx="4791075" cy="2095500"/>
+                    </a:xfrm>
+                    <a:prstGeom prst="rect">
+                      <a:avLst/>
+                    </a:prstGeom>
+                  </pic:spPr>
+                </pic:pic>
+              </a:graphicData>
+            </a:graphic>
+          </wp:inline>
+        </w:drawing>
+      </w:r>
+    </w:p>
+    <w:p>
+      <w:pPr>
+        <w:spacing w:line="240" w:lineRule="auto"/>
+        <w:ind w:firstLine="0"/>
+        <w:jc w:val="center"/>
+      </w:pPr>
+      <w:r>
+        <w:t>Рисунок</w:t>
+      </w:r>
+      <w:r>
+        <w:t xml:space="preserve"> </w:t>
+      </w:r>
+      <w:r>
+        <w:t>Б.</w:t>
+      </w:r>
+      <w:r>
+        <w:t>2</w:t>
+      </w:r>
+      <w:r>
+        <w:t xml:space="preserve"> – </w:t>
+      </w:r>
+      <w:r>
+        <w:t xml:space="preserve">Диаграмма последовательности (UML </w:t>
+      </w:r>
+      <w:proofErr w:type="spellStart"/>
+      <w:r>
+        <w:t>Sequence</w:t>
+      </w:r>
+      <w:proofErr w:type="spellEnd"/>
+      <w:r>
+        <w:t>)</w:t>
+      </w:r>
+    </w:p>
+    <w:p>
+      <w:pPr>
+        <w:ind w:firstLine="0"/>
+        <w:jc w:val="center"/>
+      </w:pPr>
+    </w:p>
+    <w:p>
+      <w:pPr>
+        <w:keepNext/>
+        <w:spacing w:line="240" w:lineRule="auto"/>
+        <w:ind w:firstLine="0"/>
+        <w:jc w:val="center"/>
+        <w:rPr>
+          <w:lang w:val="en-US"/>
+        </w:rPr>
+      </w:pPr>
+      <w:r>
+        <w:rPr>
+          <w:noProof/>
+          <w:lang w:eastAsia="ru-RU"/>
+        </w:rPr>
+        <w:drawing>
+          <wp:inline distT="0" distB="0" distL="0" distR="0">
+            <wp:extent cx="4905375" cy="2381250"/>
+            <wp:effectExtent l="19050" t="0" r="9525" b="0"/>
+            <wp:docPr id="3" name="Рисунок 2"/>
+            <wp:cNvGraphicFramePr>
+              <a:graphicFrameLocks xmlns:a="http://schemas.openxmlformats.org/drawingml/2006/main" noChangeAspect="1"/>
+            </wp:cNvGraphicFramePr>
+            <a:graphic xmlns:a="http://schemas.openxmlformats.org/drawingml/2006/main">
+              <a:graphicData uri="http://schemas.openxmlformats.org/drawingml/2006/picture">
+                <pic:pic xmlns:pic="http://schemas.openxmlformats.org/drawingml/2006/picture">
+                  <pic:nvPicPr>
+                    <pic:cNvPr id="1233863608" name="Рисунок 2"/>
+                    <pic:cNvPicPr>
+                      <a:picLocks noChangeAspect="1" noChangeArrowheads="1"/>
+                    </pic:cNvPicPr>
+                  </pic:nvPicPr>
+                  <pic:blipFill>
+                    <a:blip r:embed="rId13" cstate="print"/>
+                    <a:srcRect t="2724"/>
+                    <a:stretch>
+                      <a:fillRect/>
+                    </a:stretch>
+                  </pic:blipFill>
+                  <pic:spPr bwMode="auto">
+                    <a:xfrm>
+                      <a:off x="0" y="0"/>
+                      <a:ext cx="4905375" cy="2381250"/>
+                    </a:xfrm>
+                    <a:prstGeom prst="rect">
+                      <a:avLst/>
+                    </a:prstGeom>
+                  </pic:spPr>
+                </pic:pic>
+              </a:graphicData>
+            </a:graphic>
+          </wp:inline>
+        </w:drawing>
+      </w:r>
+    </w:p>
+    <w:p>
+      <w:pPr>
+        <w:spacing w:line="240" w:lineRule="auto"/>
+        <w:ind w:firstLine="0"/>
+        <w:jc w:val="center"/>
+      </w:pPr>
+      <w:r>
+        <w:t>Рисунок</w:t>
+      </w:r>
+      <w:r>
+        <w:t xml:space="preserve"> </w:t>
+      </w:r>
+      <w:r>
+        <w:t>Б.</w:t>
+      </w:r>
+      <w:r>
+        <w:t>3</w:t>
+      </w:r>
+      <w:r>
+        <w:t xml:space="preserve"> – </w:t>
+      </w:r>
+      <w:r>
+        <w:t xml:space="preserve">График зависимости времени обработки </w:t>
+      </w:r>
+      <w:r>
+        <w:br/>
+        <w:t>от размера входных данных</w:t>
+      </w:r>
+    </w:p>
+    <w:p>
+      <w:pPr>
+        <w:keepNext/>
+        <w:spacing w:line="240" w:lineRule="auto"/>
+        <w:ind w:firstLine="0"/>
+        <w:jc w:val="center"/>
+        <w:rPr>
+          <w:lang w:val="en-US"/>
+        </w:rPr>
+      </w:pPr>
+      <w:r>
+        <w:rPr>
+          <w:noProof/>
+          <w:lang w:eastAsia="ru-RU"/>
+        </w:rPr>
+        <w:lastRenderedPageBreak/>
+        <w:drawing>
+          <wp:inline distT="0" distB="0" distL="0" distR="0">
+            <wp:extent cx="5791200" cy="2875034"/>
+            <wp:effectExtent l="19050" t="0" r="0" b="0"/>
+            <wp:docPr id="4" name="Рисунок 2"/>
+            <wp:cNvGraphicFramePr>
+              <a:graphicFrameLocks xmlns:a="http://schemas.openxmlformats.org/drawingml/2006/main" noChangeAspect="1"/>
+            </wp:cNvGraphicFramePr>
+            <a:graphic xmlns:a="http://schemas.openxmlformats.org/drawingml/2006/main">
+              <a:graphicData uri="http://schemas.openxmlformats.org/drawingml/2006/picture">
+                <pic:pic xmlns:pic="http://schemas.openxmlformats.org/drawingml/2006/picture">
+                  <pic:nvPicPr>
+                    <pic:cNvPr id="1233863608" name="Рисунок 2"/>
+                    <pic:cNvPicPr>
+                      <a:picLocks noChangeAspect="1" noChangeArrowheads="1"/>
+                    </pic:cNvPicPr>
+                  </pic:nvPicPr>
+                  <pic:blipFill>
+                    <a:blip r:embed="rId14" cstate="print"/>
+                    <a:stretch>
+                      <a:fillRect/>
+                    </a:stretch>
+                  </pic:blipFill>
+                  <pic:spPr bwMode="auto">
+                    <a:xfrm>
+                      <a:off x="0" y="0"/>
+                      <a:ext cx="5802636" cy="2880712"/>
+                    </a:xfrm>
+                    <a:prstGeom prst="rect">
+                      <a:avLst/>
+                    </a:prstGeom>
+                  </pic:spPr>
+                </pic:pic>
+              </a:graphicData>
+            </a:graphic>
+          </wp:inline>
+        </w:drawing>
+      </w:r>
+    </w:p>
+    <w:p>
+      <w:pPr>
+        <w:spacing w:line="240" w:lineRule="auto"/>
+        <w:ind w:firstLine="0"/>
+        <w:jc w:val="center"/>
+      </w:pPr>
+      <w:r>
+        <w:t>Рисунок</w:t>
+      </w:r>
+      <w:r>
+        <w:t xml:space="preserve"> </w:t>
+      </w:r>
+      <w:r>
+        <w:t>Б.</w:t>
+      </w:r>
+      <w:r>
+        <w:t>4</w:t>
+      </w:r>
+      <w:r>
+        <w:t xml:space="preserve"> – </w:t>
+      </w:r>
+      <w:proofErr w:type="spellStart"/>
+      <w:r>
+        <w:t>Скриншот</w:t>
+      </w:r>
+      <w:proofErr w:type="spellEnd"/>
+      <w:r>
+        <w:t xml:space="preserve"> главного окна программы</w:t>
+      </w:r>
+    </w:p>
+    <w:p>
+      <w:pPr>
+        <w:keepNext/>
+        <w:spacing w:line="240" w:lineRule="auto"/>
+        <w:ind w:firstLine="0"/>
+        <w:jc w:val="center"/>
+        <w:rPr>
+          <w:lang w:val="en-US"/>
+        </w:rPr>
+      </w:pPr>
+      <w:r>
+        <w:rPr>
+          <w:noProof/>
+          <w:lang w:eastAsia="ru-RU"/>
+        </w:rPr>
+        <w:drawing>
+          <wp:inline distT="0" distB="0" distL="0" distR="0">
+            <wp:extent cx="5993814" cy="3009900"/>
+            <wp:effectExtent l="19050" t="0" r="6936" b="0"/>
+            <wp:docPr id="5" name="Рисунок 2"/>
+            <wp:cNvGraphicFramePr>
+              <a:graphicFrameLocks xmlns:a="http://schemas.openxmlformats.org/drawingml/2006/main" noChangeAspect="1"/>
+            </wp:cNvGraphicFramePr>
+            <a:graphic xmlns:a="http://schemas.openxmlformats.org/drawingml/2006/main">
+              <a:graphicData uri="http://schemas.openxmlformats.org/drawingml/2006/picture">
+                <pic:pic xmlns:pic="http://schemas.openxmlformats.org/drawingml/2006/picture">
+                  <pic:nvPicPr>
+                    <pic:cNvPr id="1233863608" name="Рисунок 2"/>
+                    <pic:cNvPicPr>
+                      <a:picLocks noChangeAspect="1" noChangeArrowheads="1"/>
+                    </pic:cNvPicPr>
+                  </pic:nvPicPr>
+                  <pic:blipFill>
+                    <a:blip r:embed="rId15" cstate="print"/>
+                    <a:stretch>
+                      <a:fillRect/>
+                    </a:stretch>
+                  </pic:blipFill>
+                  <pic:spPr bwMode="auto">
+                    <a:xfrm>
+                      <a:off x="0" y="0"/>
+                      <a:ext cx="5992319" cy="3009149"/>
+                    </a:xfrm>
+                    <a:prstGeom prst="rect">
+                      <a:avLst/>
+                    </a:prstGeom>
+                  </pic:spPr>
+                </pic:pic>
+              </a:graphicData>
+            </a:graphic>
+          </wp:inline>
+        </w:drawing>
+      </w:r>
+    </w:p>
+    <w:p>
+      <w:pPr>
+        <w:spacing w:line="240" w:lineRule="auto"/>
+        <w:ind w:firstLine="0"/>
+        <w:jc w:val="center"/>
+      </w:pPr>
+      <w:r>
+        <w:t>Рисунок</w:t>
+      </w:r>
+      <w:r>
+        <w:t xml:space="preserve"> </w:t>
+      </w:r>
+      <w:r>
+        <w:t>Б.</w:t>
+      </w:r>
+      <w:r>
+        <w:t>5</w:t>
+      </w:r>
+      <w:r>
+        <w:t xml:space="preserve"> – </w:t>
+      </w:r>
+      <w:r>
+        <w:t>Схема потоков данных в модуле обработки</w:t>
+      </w:r>
+    </w:p>
+    <w:p>
+      <w:pPr>
+        <w:ind w:firstLine="0"/>
+        <w:rPr>
+          <w:lang w:val="en-US"/>
+        </w:rPr>
+      </w:pPr>
+    </w:p>
     <w:sectPr>
-      <w:footerReference w:type="default" r:id="rId11"/>
+      <w:footerReference w:type="default" r:id="rId16"/>
       <w:pgSz w:w="11906" w:h="16838"/>
       <w:pgMar w:top="1134" w:right="850" w:bottom="1134" w:left="1701" w:header="708" w:footer="708" w:gutter="0"/>
       <w:pgNumType w:start="3"/>
@@ -4136,7 +5529,7 @@
           <w:rPr>
             <w:noProof/>
           </w:rPr>
-          <w:t>11</w:t>
+          <w:t>13</w:t>
         </w:r>
         <w:r>
           <w:rPr>
@@ -7113,7 +8506,7 @@
   <a:extraClrSchemeLst/>
   <a:extLst>
     <a:ext uri="{05A4C25C-085E-4340-85A3-A5531E510DB2}">
-      <thm15:themeFamily xmlns="" xmlns:thm15="http://schemas.microsoft.com/office/thememl/2012/main" name="Office Theme" id="{62F939B6-93AF-4DB8-9C6B-D6C7DFDC589F}" vid="{4A3C46E8-61CC-4603-A589-7422A47A8E4A}"/>
+      <thm15:themeFamily xmlns:thm15="http://schemas.microsoft.com/office/thememl/2012/main" xmlns="" name="Office Theme" id="{62F939B6-93AF-4DB8-9C6B-D6C7DFDC589F}" vid="{4A3C46E8-61CC-4603-A589-7422A47A8E4A}"/>
     </a:ext>
   </a:extLst>
 </a:theme>
@@ -7124,7 +8517,7 @@
 </file>
 
 <file path=customXml/itemProps1.xml><?xml version="1.0" encoding="utf-8"?>
-<ds:datastoreItem xmlns:ds="http://schemas.openxmlformats.org/officeDocument/2006/customXml" ds:itemID="{EB50D21C-92D7-4BD0-A9B4-8BD8146560F2}">
+<ds:datastoreItem xmlns:ds="http://schemas.openxmlformats.org/officeDocument/2006/customXml" ds:itemID="{194D5DEC-A028-4870-A849-B5646887FC6E}">
   <ds:schemaRefs>
     <ds:schemaRef ds:uri="http://schemas.openxmlformats.org/officeDocument/2006/bibliography"/>
   </ds:schemaRefs>

</xml_diff>